<commit_message>
fix(kt03): add public website Page Object suite
Co-authored-by: Cursor <cursoragent@cursor.com>
</commit_message>
<xml_diff>
--- a/reports/KT03.docx
+++ b/reports/KT03.docx
@@ -4,7 +4,7 @@
   <w:body>
     <w:p>
       <w:pPr>
-        <w:spacing w:after="120" w:line="276" w:lineRule="auto"/>
+        <w:spacing w:after="120"/>
         <w:jc w:val="center"/>
       </w:pPr>
       <w:r>
@@ -18,75 +18,7 @@
     </w:p>
     <w:p>
       <w:pPr>
-        <w:spacing w:after="120" w:line="276" w:lineRule="auto"/>
-        <w:jc w:val="center"/>
-      </w:pPr>
-      <w:r>
-        <w:rPr>
-          <w:rFonts w:ascii="Times New Roman" w:hAnsi="Times New Roman" w:eastAsia="Times New Roman"/>
-          <w:b w:val="0"/>
-          <w:sz w:val="24"/>
-        </w:rPr>
-        <w:t>Учебное заведение: ______________________________</w:t>
-      </w:r>
-    </w:p>
-    <w:p>
-      <w:pPr>
-        <w:spacing w:after="120" w:line="276" w:lineRule="auto"/>
-        <w:jc w:val="center"/>
-      </w:pPr>
-      <w:r>
-        <w:rPr>
-          <w:rFonts w:ascii="Times New Roman" w:hAnsi="Times New Roman" w:eastAsia="Times New Roman"/>
-          <w:b w:val="0"/>
-          <w:sz w:val="24"/>
-        </w:rPr>
-        <w:t>Студент: _______________________________________</w:t>
-      </w:r>
-    </w:p>
-    <w:p>
-      <w:pPr>
-        <w:spacing w:after="120" w:line="276" w:lineRule="auto"/>
-        <w:jc w:val="center"/>
-      </w:pPr>
-      <w:r>
-        <w:rPr>
-          <w:rFonts w:ascii="Times New Roman" w:hAnsi="Times New Roman" w:eastAsia="Times New Roman"/>
-          <w:b w:val="0"/>
-          <w:sz w:val="24"/>
-        </w:rPr>
-        <w:t>Преподаватель: _________________________________</w:t>
-      </w:r>
-    </w:p>
-    <w:p>
-      <w:pPr>
-        <w:spacing w:after="120" w:line="276" w:lineRule="auto"/>
-        <w:jc w:val="center"/>
-      </w:pPr>
-      <w:r>
-        <w:rPr>
-          <w:rFonts w:ascii="Times New Roman" w:hAnsi="Times New Roman" w:eastAsia="Times New Roman"/>
-          <w:b w:val="0"/>
-          <w:sz w:val="24"/>
-        </w:rPr>
-        <w:t>Группа: ________________________________________</w:t>
-      </w:r>
-    </w:p>
-    <w:p>
-      <w:pPr>
-        <w:spacing w:after="120" w:line="276" w:lineRule="auto"/>
-      </w:pPr>
-      <w:r>
-        <w:rPr>
-          <w:rFonts w:ascii="Times New Roman" w:hAnsi="Times New Roman" w:eastAsia="Times New Roman"/>
-          <w:b w:val="0"/>
-          <w:sz w:val="24"/>
-        </w:rPr>
-      </w:r>
-    </w:p>
-    <w:p>
-      <w:pPr>
-        <w:spacing w:after="120" w:line="276" w:lineRule="auto"/>
+        <w:spacing w:after="120"/>
         <w:jc w:val="center"/>
       </w:pPr>
       <w:r>
@@ -100,7 +32,7 @@
     </w:p>
     <w:p>
       <w:pPr>
-        <w:spacing w:after="120" w:line="276" w:lineRule="auto"/>
+        <w:spacing w:after="120"/>
         <w:jc w:val="center"/>
       </w:pPr>
       <w:r>
@@ -109,21 +41,7 @@
           <w:b w:val="0"/>
           <w:sz w:val="24"/>
         </w:rPr>
-        <w:t>Отчёт по контрольной точке</w:t>
-      </w:r>
-    </w:p>
-    <w:p>
-      <w:pPr>
-        <w:spacing w:after="120" w:line="276" w:lineRule="auto"/>
-        <w:jc w:val="center"/>
-      </w:pPr>
-      <w:r>
-        <w:rPr>
-          <w:rFonts w:ascii="Times New Roman" w:hAnsi="Times New Roman" w:eastAsia="Times New Roman"/>
-          <w:b w:val="0"/>
-          <w:sz w:val="24"/>
-        </w:rPr>
-        <w:t>Дата выполнения: 2026-10-09</w:t>
+        <w:t>Отчёт (включая remediation 2026-10-10)</w:t>
       </w:r>
     </w:p>
     <w:p>
@@ -136,12 +54,12 @@
           <w:b/>
           <w:sz w:val="28"/>
         </w:rPr>
-        <w:t>1. Цель работы</w:t>
+        <w:t>1. Цель</w:t>
       </w:r>
     </w:p>
     <w:p>
       <w:pPr>
-        <w:spacing w:after="120" w:line="276" w:lineRule="auto"/>
+        <w:spacing w:after="120"/>
       </w:pPr>
       <w:r>
         <w:rPr>
@@ -149,7 +67,7 @@
           <w:b w:val="0"/>
           <w:sz w:val="24"/>
         </w:rPr>
-        <w:t>Цель контрольной точки №3 — применить паттерн Page Object к уже реализованным сценариям Selenium (окна/вкладки и iframe), чтобы отделить локаторы и действия страницы от тестовых assertions и повысить сопровождаемость автотестов.</w:t>
+        <w:t>Применить Page Object к публичному сайту Sauce Demo и сохранить исторический локальный PO для окон/iframe.</w:t>
       </w:r>
     </w:p>
     <w:p>
@@ -162,12 +80,12 @@
           <w:b/>
           <w:sz w:val="28"/>
         </w:rPr>
-        <w:t>2. Суть паттерна Page Object</w:t>
+        <w:t>2. Архитектура</w:t>
       </w:r>
     </w:p>
     <w:p>
       <w:pPr>
-        <w:spacing w:after="120" w:line="276" w:lineRule="auto"/>
+        <w:spacing w:after="120"/>
       </w:pPr>
       <w:r>
         <w:rPr>
@@ -175,7 +93,33 @@
           <w:b w:val="0"/>
           <w:sz w:val="24"/>
         </w:rPr>
-        <w:t>Page Object — это объектно-ориентированный приём организации UI-автотестов: каждая страница (или логический фрагмент UI) представляется классом. В классе хранятся локаторы и методы действий пользователя; тесты вызывают эти методы и проверяют ожидаемое бизнес-поведение. Благодаря этому изменения вёрстки правятся в одном месте — в Page Object, а не во всех тестах.</w:t>
+        <w:t>• Исторический: BasePage, WindowsMainPage/WindowsSecondaryPage, IframePage</w:t>
+      </w:r>
+    </w:p>
+    <w:p>
+      <w:pPr>
+        <w:spacing w:after="120"/>
+      </w:pPr>
+      <w:r>
+        <w:rPr>
+          <w:rFonts w:ascii="Times New Roman" w:hAnsi="Times New Roman" w:eastAsia="Times New Roman"/>
+          <w:b w:val="0"/>
+          <w:sz w:val="24"/>
+        </w:rPr>
+        <w:t>• Remediation: selenium/pages/sauce/* (Login, Inventory, Product, Cart, Checkout)</w:t>
+      </w:r>
+    </w:p>
+    <w:p>
+      <w:pPr>
+        <w:spacing w:after="120"/>
+      </w:pPr>
+      <w:r>
+        <w:rPr>
+          <w:rFonts w:ascii="Times New Roman" w:hAnsi="Times New Roman" w:eastAsia="Times New Roman"/>
+          <w:b w:val="0"/>
+          <w:sz w:val="24"/>
+        </w:rPr>
+        <w:t>• Тесты: test_kt03_page_object.py + test_kt03_sauce_po.py</w:t>
       </w:r>
     </w:p>
     <w:p>
@@ -188,85 +132,72 @@
           <w:b/>
           <w:sz w:val="28"/>
         </w:rPr>
-        <w:t>3. Архитектура проекта</w:t>
+        <w:t>3. Команды</w:t>
       </w:r>
     </w:p>
     <w:p>
       <w:pPr>
-        <w:spacing w:after="120" w:line="276" w:lineRule="auto"/>
+        <w:spacing w:after="0"/>
       </w:pPr>
       <w:r>
         <w:rPr>
-          <w:rFonts w:ascii="Times New Roman" w:hAnsi="Times New Roman" w:eastAsia="Times New Roman"/>
+          <w:rFonts w:ascii="Consolas" w:hAnsi="Consolas" w:eastAsia="Consolas"/>
           <w:b w:val="0"/>
-          <w:sz w:val="24"/>
+          <w:sz w:val="18"/>
         </w:rPr>
-        <w:t>• selenium/pages/base_page.py — общие helper-методы WebDriver.</w:t>
+        <w:t># Публичный Sauce Demo PO</w:t>
       </w:r>
     </w:p>
     <w:p>
       <w:pPr>
-        <w:spacing w:after="120" w:line="276" w:lineRule="auto"/>
+        <w:spacing w:after="0"/>
       </w:pPr>
       <w:r>
         <w:rPr>
-          <w:rFonts w:ascii="Times New Roman" w:hAnsi="Times New Roman" w:eastAsia="Times New Roman"/>
+          <w:rFonts w:ascii="Consolas" w:hAnsi="Consolas" w:eastAsia="Consolas"/>
           <w:b w:val="0"/>
-          <w:sz w:val="24"/>
+          <w:sz w:val="18"/>
         </w:rPr>
-        <w:t>• selenium/pages/windows_page.py — WindowsMainPage / WindowsSecondaryPage (алиас WindowsPage).</w:t>
+        <w:t>.\.venv\Scripts\python.exe -m pytest selenium\tests\test_kt03_sauce_po.py -v --browser=chrome --page-load-strategy=eager</w:t>
       </w:r>
     </w:p>
     <w:p>
       <w:pPr>
-        <w:spacing w:after="120" w:line="276" w:lineRule="auto"/>
+        <w:spacing w:after="0"/>
       </w:pPr>
       <w:r>
         <w:rPr>
-          <w:rFonts w:ascii="Times New Roman" w:hAnsi="Times New Roman" w:eastAsia="Times New Roman"/>
+          <w:rFonts w:ascii="Consolas" w:hAnsi="Consolas" w:eastAsia="Consolas"/>
           <w:b w:val="0"/>
-          <w:sz w:val="24"/>
+          <w:sz w:val="18"/>
         </w:rPr>
-        <w:t>• selenium/pages/iframe_page.py — IframePage для host + child iframe.</w:t>
+        <w:t xml:space="preserve"> </w:t>
       </w:r>
     </w:p>
     <w:p>
       <w:pPr>
-        <w:spacing w:after="120" w:line="276" w:lineRule="auto"/>
+        <w:spacing w:after="0"/>
       </w:pPr>
       <w:r>
         <w:rPr>
-          <w:rFonts w:ascii="Times New Roman" w:hAnsi="Times New Roman" w:eastAsia="Times New Roman"/>
+          <w:rFonts w:ascii="Consolas" w:hAnsi="Consolas" w:eastAsia="Consolas"/>
           <w:b w:val="0"/>
-          <w:sz w:val="24"/>
+          <w:sz w:val="18"/>
         </w:rPr>
-        <w:t>• selenium/tests/test_kt03_page_object.py — не менее четырёх тестов с assertions.</w:t>
+        <w:t># Исторический локальный PO</w:t>
       </w:r>
     </w:p>
     <w:p>
       <w:pPr>
-        <w:spacing w:after="120" w:line="276" w:lineRule="auto"/>
+        <w:spacing w:after="0"/>
       </w:pPr>
       <w:r>
         <w:rPr>
-          <w:rFonts w:ascii="Times New Roman" w:hAnsi="Times New Roman" w:eastAsia="Times New Roman"/>
+          <w:rFonts w:ascii="Consolas" w:hAnsi="Consolas" w:eastAsia="Consolas"/>
           <w:b w:val="0"/>
-          <w:sz w:val="24"/>
+          <w:sz w:val="18"/>
         </w:rPr>
-        <w:t>• Фикстуры HTML КТ 02 переиспользуются без дублирования разметки.</w:t>
-      </w:r>
-    </w:p>
-    <w:p>
-      <w:pPr>
-        <w:spacing w:after="120" w:line="276" w:lineRule="auto"/>
-      </w:pPr>
-      <w:r>
-        <w:rPr>
-          <w:rFonts w:ascii="Times New Roman" w:hAnsi="Times New Roman" w:eastAsia="Times New Roman"/>
-          <w:b w:val="0"/>
-          <w:sz w:val="24"/>
-        </w:rPr>
-        <w:t>• Тесты КТ 01 и КТ 02 сохранены и прошли регрессию.</w:t>
+        <w:t>.\.venv\Scripts\python.exe -m pytest selenium\tests\test_kt03_page_object.py -v --browser=chrome</w:t>
       </w:r>
     </w:p>
     <w:p>
@@ -279,12 +210,12 @@
           <w:b/>
           <w:sz w:val="28"/>
         </w:rPr>
-        <w:t>4. Ответственность классов</w:t>
+        <w:t>4. Результаты</w:t>
       </w:r>
     </w:p>
     <w:p>
       <w:pPr>
-        <w:spacing w:after="120" w:line="276" w:lineRule="auto"/>
+        <w:spacing w:after="120"/>
       </w:pPr>
       <w:r>
         <w:rPr>
@@ -292,12 +223,129 @@
           <w:b w:val="0"/>
           <w:sz w:val="24"/>
         </w:rPr>
-        <w:t>BasePage: открытие URL, поиск/ожидание элементов, click, type_text, работа с window handles и iframe (switch_to_frame / default_content).</w:t>
+        <w:t>Публичный PO (2026-10-10):</w:t>
       </w:r>
     </w:p>
     <w:p>
       <w:pPr>
-        <w:spacing w:after="120" w:line="276" w:lineRule="auto"/>
+        <w:spacing w:after="0"/>
+      </w:pPr>
+      <w:r>
+        <w:rPr>
+          <w:rFonts w:ascii="Consolas" w:hAnsi="Consolas" w:eastAsia="Consolas"/>
+          <w:b w:val="0"/>
+          <w:sz w:val="18"/>
+        </w:rPr>
+        <w:t>============================= test session starts =============================</w:t>
+      </w:r>
+    </w:p>
+    <w:p>
+      <w:pPr>
+        <w:spacing w:after="0"/>
+      </w:pPr>
+      <w:r>
+        <w:rPr>
+          <w:rFonts w:ascii="Consolas" w:hAnsi="Consolas" w:eastAsia="Consolas"/>
+          <w:b w:val="0"/>
+          <w:sz w:val="18"/>
+        </w:rPr>
+        <w:t>platform win32 -- Python 3.13.2, pytest-8.4.2</w:t>
+      </w:r>
+    </w:p>
+    <w:p>
+      <w:pPr>
+        <w:spacing w:after="0"/>
+      </w:pPr>
+      <w:r>
+        <w:rPr>
+          <w:rFonts w:ascii="Consolas" w:hAnsi="Consolas" w:eastAsia="Consolas"/>
+          <w:b w:val="0"/>
+          <w:sz w:val="18"/>
+        </w:rPr>
+        <w:t>collecting ... collected 5 items</w:t>
+      </w:r>
+    </w:p>
+    <w:p>
+      <w:pPr>
+        <w:spacing w:after="0"/>
+      </w:pPr>
+      <w:r>
+        <w:rPr>
+          <w:rFonts w:ascii="Consolas" w:hAnsi="Consolas" w:eastAsia="Consolas"/>
+          <w:b w:val="0"/>
+          <w:sz w:val="18"/>
+        </w:rPr>
+        <w:t>selenium/tests/test_kt03_sauce_po.py::test_po_login_page_opens_and_authenticates PASSED</w:t>
+      </w:r>
+    </w:p>
+    <w:p>
+      <w:pPr>
+        <w:spacing w:after="0"/>
+      </w:pPr>
+      <w:r>
+        <w:rPr>
+          <w:rFonts w:ascii="Consolas" w:hAnsi="Consolas" w:eastAsia="Consolas"/>
+          <w:b w:val="0"/>
+          <w:sz w:val="18"/>
+        </w:rPr>
+        <w:t>selenium/tests/test_kt03_sauce_po.py::test_po_inventory_sort_and_open_product PASSED</w:t>
+      </w:r>
+    </w:p>
+    <w:p>
+      <w:pPr>
+        <w:spacing w:after="0"/>
+      </w:pPr>
+      <w:r>
+        <w:rPr>
+          <w:rFonts w:ascii="Consolas" w:hAnsi="Consolas" w:eastAsia="Consolas"/>
+          <w:b w:val="0"/>
+          <w:sz w:val="18"/>
+        </w:rPr>
+        <w:t>selenium/tests/test_kt03_sauce_po.py::test_po_product_add_and_cart PASSED</w:t>
+      </w:r>
+    </w:p>
+    <w:p>
+      <w:pPr>
+        <w:spacing w:after="0"/>
+      </w:pPr>
+      <w:r>
+        <w:rPr>
+          <w:rFonts w:ascii="Consolas" w:hAnsi="Consolas" w:eastAsia="Consolas"/>
+          <w:b w:val="0"/>
+          <w:sz w:val="18"/>
+        </w:rPr>
+        <w:t>selenium/tests/test_kt03_sauce_po.py::test_po_checkout_flow PASSED</w:t>
+      </w:r>
+    </w:p>
+    <w:p>
+      <w:pPr>
+        <w:spacing w:after="0"/>
+      </w:pPr>
+      <w:r>
+        <w:rPr>
+          <w:rFonts w:ascii="Consolas" w:hAnsi="Consolas" w:eastAsia="Consolas"/>
+          <w:b w:val="0"/>
+          <w:sz w:val="18"/>
+        </w:rPr>
+        <w:t>selenium/tests/test_kt03_sauce_po.py::test_po_menu_logout PASSED</w:t>
+      </w:r>
+    </w:p>
+    <w:p>
+      <w:pPr>
+        <w:spacing w:after="0"/>
+      </w:pPr>
+      <w:r>
+        <w:rPr>
+          <w:rFonts w:ascii="Consolas" w:hAnsi="Consolas" w:eastAsia="Consolas"/>
+          <w:b w:val="0"/>
+          <w:sz w:val="18"/>
+        </w:rPr>
+        <w:t>============================= 5 passed in 21.11s ==============================</w:t>
+      </w:r>
+    </w:p>
+    <w:p>
+      <w:pPr>
+        <w:spacing w:after="120"/>
       </w:pPr>
       <w:r>
         <w:rPr>
@@ -305,20 +353,33 @@
           <w:b w:val="0"/>
           <w:sz w:val="24"/>
         </w:rPr>
-        <w:t>WindowsPage (WindowsMainPage): локаторы главного окна, open_secondary_window(). WindowsSecondaryPage: переключение на новое окно, чтение содержимого, close_and_return_to(original_handle).</w:t>
+        <w:t>Исторический PO (сохранён):</w:t>
       </w:r>
     </w:p>
     <w:p>
       <w:pPr>
-        <w:spacing w:after="120" w:line="276" w:lineRule="auto"/>
+        <w:spacing w:after="0"/>
       </w:pPr>
       <w:r>
         <w:rPr>
-          <w:rFonts w:ascii="Times New Roman" w:hAnsi="Times New Roman" w:eastAsia="Times New Roman"/>
+          <w:rFonts w:ascii="Consolas" w:hAnsi="Consolas" w:eastAsia="Consolas"/>
           <w:b w:val="0"/>
-          <w:sz w:val="24"/>
+          <w:sz w:val="18"/>
         </w:rPr>
-        <w:t>IframePage: открытие host-страницы, enter_iframe(), submit_frame_value(), leave_iframe() через default_content(), проверка недоступности child-элементов.</w:t>
+        <w:t>============================= 4 passed in 14.90s ==============================</w:t>
+      </w:r>
+    </w:p>
+    <w:p>
+      <w:pPr>
+        <w:spacing w:after="0"/>
+      </w:pPr>
+      <w:r>
+        <w:rPr>
+          <w:rFonts w:ascii="Consolas" w:hAnsi="Consolas" w:eastAsia="Consolas"/>
+          <w:b w:val="0"/>
+          <w:sz w:val="18"/>
+        </w:rPr>
+        <w:t>selenium/tests/test_kt03_page_object.py (windows/iframe Page Objects)</w:t>
       </w:r>
     </w:p>
     <w:p>
@@ -331,735 +392,7 @@
           <w:b/>
           <w:sz w:val="28"/>
         </w:rPr>
-        <w:t>5. Примеры кода</w:t>
-      </w:r>
-    </w:p>
-    <w:p>
-      <w:pPr>
-        <w:spacing w:after="120" w:line="276" w:lineRule="auto"/>
-      </w:pPr>
-      <w:r>
-        <w:rPr>
-          <w:rFonts w:ascii="Times New Roman" w:hAnsi="Times New Roman" w:eastAsia="Times New Roman"/>
-          <w:b w:val="0"/>
-          <w:sz w:val="24"/>
-        </w:rPr>
-        <w:t>BasePage (фрагмент):</w:t>
-      </w:r>
-    </w:p>
-    <w:p>
-      <w:pPr>
-        <w:spacing w:after="0" w:before="0" w:line="240" w:lineRule="auto"/>
-      </w:pPr>
-      <w:r>
-        <w:rPr>
-          <w:rFonts w:ascii="Consolas" w:hAnsi="Consolas" w:eastAsia="Consolas"/>
-          <w:b w:val="0"/>
-          <w:sz w:val="18"/>
-        </w:rPr>
-        <w:t>class BasePage:</w:t>
-      </w:r>
-    </w:p>
-    <w:p>
-      <w:pPr>
-        <w:spacing w:after="0" w:before="0" w:line="240" w:lineRule="auto"/>
-      </w:pPr>
-      <w:r>
-        <w:rPr>
-          <w:rFonts w:ascii="Consolas" w:hAnsi="Consolas" w:eastAsia="Consolas"/>
-          <w:b w:val="0"/>
-          <w:sz w:val="18"/>
-        </w:rPr>
-        <w:t xml:space="preserve">    def __init__(self, driver, timeout=10):</w:t>
-      </w:r>
-    </w:p>
-    <w:p>
-      <w:pPr>
-        <w:spacing w:after="0" w:before="0" w:line="240" w:lineRule="auto"/>
-      </w:pPr>
-      <w:r>
-        <w:rPr>
-          <w:rFonts w:ascii="Consolas" w:hAnsi="Consolas" w:eastAsia="Consolas"/>
-          <w:b w:val="0"/>
-          <w:sz w:val="18"/>
-        </w:rPr>
-        <w:t xml:space="preserve">        self.driver = driver</w:t>
-      </w:r>
-    </w:p>
-    <w:p>
-      <w:pPr>
-        <w:spacing w:after="0" w:before="0" w:line="240" w:lineRule="auto"/>
-      </w:pPr>
-      <w:r>
-        <w:rPr>
-          <w:rFonts w:ascii="Consolas" w:hAnsi="Consolas" w:eastAsia="Consolas"/>
-          <w:b w:val="0"/>
-          <w:sz w:val="18"/>
-        </w:rPr>
-        <w:t xml:space="preserve">        self.wait = WebDriverWait(driver, timeout)</w:t>
-      </w:r>
-    </w:p>
-    <w:p>
-      <w:pPr>
-        <w:spacing w:after="0" w:before="0" w:line="240" w:lineRule="auto"/>
-      </w:pPr>
-      <w:r>
-        <w:rPr>
-          <w:rFonts w:ascii="Consolas" w:hAnsi="Consolas" w:eastAsia="Consolas"/>
-          <w:b w:val="0"/>
-          <w:sz w:val="18"/>
-        </w:rPr>
-        <w:t xml:space="preserve"> </w:t>
-      </w:r>
-    </w:p>
-    <w:p>
-      <w:pPr>
-        <w:spacing w:after="0" w:before="0" w:line="240" w:lineRule="auto"/>
-      </w:pPr>
-      <w:r>
-        <w:rPr>
-          <w:rFonts w:ascii="Consolas" w:hAnsi="Consolas" w:eastAsia="Consolas"/>
-          <w:b w:val="0"/>
-          <w:sz w:val="18"/>
-        </w:rPr>
-        <w:t xml:space="preserve">    def open(self, url): ...</w:t>
-      </w:r>
-    </w:p>
-    <w:p>
-      <w:pPr>
-        <w:spacing w:after="0" w:before="0" w:line="240" w:lineRule="auto"/>
-      </w:pPr>
-      <w:r>
-        <w:rPr>
-          <w:rFonts w:ascii="Consolas" w:hAnsi="Consolas" w:eastAsia="Consolas"/>
-          <w:b w:val="0"/>
-          <w:sz w:val="18"/>
-        </w:rPr>
-        <w:t xml:space="preserve">    def find_visible(self, locator): ...</w:t>
-      </w:r>
-    </w:p>
-    <w:p>
-      <w:pPr>
-        <w:spacing w:after="0" w:before="0" w:line="240" w:lineRule="auto"/>
-      </w:pPr>
-      <w:r>
-        <w:rPr>
-          <w:rFonts w:ascii="Consolas" w:hAnsi="Consolas" w:eastAsia="Consolas"/>
-          <w:b w:val="0"/>
-          <w:sz w:val="18"/>
-        </w:rPr>
-        <w:t xml:space="preserve">    def click(self, locator): ...</w:t>
-      </w:r>
-    </w:p>
-    <w:p>
-      <w:pPr>
-        <w:spacing w:after="0" w:before="0" w:line="240" w:lineRule="auto"/>
-      </w:pPr>
-      <w:r>
-        <w:rPr>
-          <w:rFonts w:ascii="Consolas" w:hAnsi="Consolas" w:eastAsia="Consolas"/>
-          <w:b w:val="0"/>
-          <w:sz w:val="18"/>
-        </w:rPr>
-        <w:t xml:space="preserve">    def type_text(self, locator, text): ...</w:t>
-      </w:r>
-    </w:p>
-    <w:p>
-      <w:pPr>
-        <w:spacing w:after="0" w:before="0" w:line="240" w:lineRule="auto"/>
-      </w:pPr>
-      <w:r>
-        <w:rPr>
-          <w:rFonts w:ascii="Consolas" w:hAnsi="Consolas" w:eastAsia="Consolas"/>
-          <w:b w:val="0"/>
-          <w:sz w:val="18"/>
-        </w:rPr>
-        <w:t xml:space="preserve">    def switch_to_window(self, handle): ...</w:t>
-      </w:r>
-    </w:p>
-    <w:p>
-      <w:pPr>
-        <w:spacing w:after="0" w:before="0" w:line="240" w:lineRule="auto"/>
-      </w:pPr>
-      <w:r>
-        <w:rPr>
-          <w:rFonts w:ascii="Consolas" w:hAnsi="Consolas" w:eastAsia="Consolas"/>
-          <w:b w:val="0"/>
-          <w:sz w:val="18"/>
-        </w:rPr>
-        <w:t xml:space="preserve">    def switch_to_frame(self, locator): ...</w:t>
-      </w:r>
-    </w:p>
-    <w:p>
-      <w:pPr>
-        <w:spacing w:after="0" w:before="0" w:line="240" w:lineRule="auto"/>
-      </w:pPr>
-      <w:r>
-        <w:rPr>
-          <w:rFonts w:ascii="Consolas" w:hAnsi="Consolas" w:eastAsia="Consolas"/>
-          <w:b w:val="0"/>
-          <w:sz w:val="18"/>
-        </w:rPr>
-        <w:t xml:space="preserve">    def switch_to_default_content(self): ...</w:t>
-      </w:r>
-    </w:p>
-    <w:p>
-      <w:pPr>
-        <w:spacing w:after="120" w:line="276" w:lineRule="auto"/>
-      </w:pPr>
-      <w:r>
-        <w:rPr>
-          <w:rFonts w:ascii="Times New Roman" w:hAnsi="Times New Roman" w:eastAsia="Times New Roman"/>
-          <w:b w:val="0"/>
-          <w:sz w:val="24"/>
-        </w:rPr>
-        <w:t>Windows Page Objects (фрагмент):</w:t>
-      </w:r>
-    </w:p>
-    <w:p>
-      <w:pPr>
-        <w:spacing w:after="0" w:before="0" w:line="240" w:lineRule="auto"/>
-      </w:pPr>
-      <w:r>
-        <w:rPr>
-          <w:rFonts w:ascii="Consolas" w:hAnsi="Consolas" w:eastAsia="Consolas"/>
-          <w:b w:val="0"/>
-          <w:sz w:val="18"/>
-        </w:rPr>
-        <w:t>class WindowsMainPage(BasePage):</w:t>
-      </w:r>
-    </w:p>
-    <w:p>
-      <w:pPr>
-        <w:spacing w:after="0" w:before="0" w:line="240" w:lineRule="auto"/>
-      </w:pPr>
-      <w:r>
-        <w:rPr>
-          <w:rFonts w:ascii="Consolas" w:hAnsi="Consolas" w:eastAsia="Consolas"/>
-          <w:b w:val="0"/>
-          <w:sz w:val="18"/>
-        </w:rPr>
-        <w:t xml:space="preserve">    OPEN_NEW_WINDOW = (By.ID, "open-new-window")</w:t>
-      </w:r>
-    </w:p>
-    <w:p>
-      <w:pPr>
-        <w:spacing w:after="0" w:before="0" w:line="240" w:lineRule="auto"/>
-      </w:pPr>
-      <w:r>
-        <w:rPr>
-          <w:rFonts w:ascii="Consolas" w:hAnsi="Consolas" w:eastAsia="Consolas"/>
-          <w:b w:val="0"/>
-          <w:sz w:val="18"/>
-        </w:rPr>
-        <w:t xml:space="preserve">    def open_secondary_window(self) -&gt; str: ...</w:t>
-      </w:r>
-    </w:p>
-    <w:p>
-      <w:pPr>
-        <w:spacing w:after="0" w:before="0" w:line="240" w:lineRule="auto"/>
-      </w:pPr>
-      <w:r>
-        <w:rPr>
-          <w:rFonts w:ascii="Consolas" w:hAnsi="Consolas" w:eastAsia="Consolas"/>
-          <w:b w:val="0"/>
-          <w:sz w:val="18"/>
-        </w:rPr>
-        <w:t xml:space="preserve"> </w:t>
-      </w:r>
-    </w:p>
-    <w:p>
-      <w:pPr>
-        <w:spacing w:after="0" w:before="0" w:line="240" w:lineRule="auto"/>
-      </w:pPr>
-      <w:r>
-        <w:rPr>
-          <w:rFonts w:ascii="Consolas" w:hAnsi="Consolas" w:eastAsia="Consolas"/>
-          <w:b w:val="0"/>
-          <w:sz w:val="18"/>
-        </w:rPr>
-        <w:t>class WindowsSecondaryPage(BasePage):</w:t>
-      </w:r>
-    </w:p>
-    <w:p>
-      <w:pPr>
-        <w:spacing w:after="0" w:before="0" w:line="240" w:lineRule="auto"/>
-      </w:pPr>
-      <w:r>
-        <w:rPr>
-          <w:rFonts w:ascii="Consolas" w:hAnsi="Consolas" w:eastAsia="Consolas"/>
-          <w:b w:val="0"/>
-          <w:sz w:val="18"/>
-        </w:rPr>
-        <w:t xml:space="preserve">    NEW_HEADING = (By.ID, "new-heading")</w:t>
-      </w:r>
-    </w:p>
-    <w:p>
-      <w:pPr>
-        <w:spacing w:after="0" w:before="0" w:line="240" w:lineRule="auto"/>
-      </w:pPr>
-      <w:r>
-        <w:rPr>
-          <w:rFonts w:ascii="Consolas" w:hAnsi="Consolas" w:eastAsia="Consolas"/>
-          <w:b w:val="0"/>
-          <w:sz w:val="18"/>
-        </w:rPr>
-        <w:t xml:space="preserve">    def switch_to(self, handle): ...</w:t>
-      </w:r>
-    </w:p>
-    <w:p>
-      <w:pPr>
-        <w:spacing w:after="0" w:before="0" w:line="240" w:lineRule="auto"/>
-      </w:pPr>
-      <w:r>
-        <w:rPr>
-          <w:rFonts w:ascii="Consolas" w:hAnsi="Consolas" w:eastAsia="Consolas"/>
-          <w:b w:val="0"/>
-          <w:sz w:val="18"/>
-        </w:rPr>
-        <w:t xml:space="preserve">    def close_and_return_to(self, original_handle): ...</w:t>
-      </w:r>
-    </w:p>
-    <w:p>
-      <w:pPr>
-        <w:spacing w:after="120" w:line="276" w:lineRule="auto"/>
-      </w:pPr>
-      <w:r>
-        <w:rPr>
-          <w:rFonts w:ascii="Times New Roman" w:hAnsi="Times New Roman" w:eastAsia="Times New Roman"/>
-          <w:b w:val="0"/>
-          <w:sz w:val="24"/>
-        </w:rPr>
-        <w:t>IframePage (фрагмент):</w:t>
-      </w:r>
-    </w:p>
-    <w:p>
-      <w:pPr>
-        <w:spacing w:after="0" w:before="0" w:line="240" w:lineRule="auto"/>
-      </w:pPr>
-      <w:r>
-        <w:rPr>
-          <w:rFonts w:ascii="Consolas" w:hAnsi="Consolas" w:eastAsia="Consolas"/>
-          <w:b w:val="0"/>
-          <w:sz w:val="18"/>
-        </w:rPr>
-        <w:t>class IframePage(BasePage):</w:t>
-      </w:r>
-    </w:p>
-    <w:p>
-      <w:pPr>
-        <w:spacing w:after="0" w:before="0" w:line="240" w:lineRule="auto"/>
-      </w:pPr>
-      <w:r>
-        <w:rPr>
-          <w:rFonts w:ascii="Consolas" w:hAnsi="Consolas" w:eastAsia="Consolas"/>
-          <w:b w:val="0"/>
-          <w:sz w:val="18"/>
-        </w:rPr>
-        <w:t xml:space="preserve">    DEMO_FRAME = (By.ID, "demo-frame")</w:t>
-      </w:r>
-    </w:p>
-    <w:p>
-      <w:pPr>
-        <w:spacing w:after="0" w:before="0" w:line="240" w:lineRule="auto"/>
-      </w:pPr>
-      <w:r>
-        <w:rPr>
-          <w:rFonts w:ascii="Consolas" w:hAnsi="Consolas" w:eastAsia="Consolas"/>
-          <w:b w:val="0"/>
-          <w:sz w:val="18"/>
-        </w:rPr>
-        <w:t xml:space="preserve">    FRAME_INPUT = (By.ID, "frame-input")</w:t>
-      </w:r>
-    </w:p>
-    <w:p>
-      <w:pPr>
-        <w:spacing w:after="0" w:before="0" w:line="240" w:lineRule="auto"/>
-      </w:pPr>
-      <w:r>
-        <w:rPr>
-          <w:rFonts w:ascii="Consolas" w:hAnsi="Consolas" w:eastAsia="Consolas"/>
-          <w:b w:val="0"/>
-          <w:sz w:val="18"/>
-        </w:rPr>
-        <w:t xml:space="preserve">    def enter_iframe(self): ...</w:t>
-      </w:r>
-    </w:p>
-    <w:p>
-      <w:pPr>
-        <w:spacing w:after="0" w:before="0" w:line="240" w:lineRule="auto"/>
-      </w:pPr>
-      <w:r>
-        <w:rPr>
-          <w:rFonts w:ascii="Consolas" w:hAnsi="Consolas" w:eastAsia="Consolas"/>
-          <w:b w:val="0"/>
-          <w:sz w:val="18"/>
-        </w:rPr>
-        <w:t xml:space="preserve">    def submit_frame_value(self, value: str) -&gt; str: ...</w:t>
-      </w:r>
-    </w:p>
-    <w:p>
-      <w:pPr>
-        <w:spacing w:after="0" w:before="0" w:line="240" w:lineRule="auto"/>
-      </w:pPr>
-      <w:r>
-        <w:rPr>
-          <w:rFonts w:ascii="Consolas" w:hAnsi="Consolas" w:eastAsia="Consolas"/>
-          <w:b w:val="0"/>
-          <w:sz w:val="18"/>
-        </w:rPr>
-        <w:t xml:space="preserve">    def leave_iframe(self): ...</w:t>
-      </w:r>
-    </w:p>
-    <w:p>
-      <w:pPr>
-        <w:pStyle w:val="Heading1"/>
-      </w:pPr>
-      <w:r>
-        <w:rPr>
-          <w:rFonts w:ascii="Times New Roman" w:hAnsi="Times New Roman" w:eastAsia="Times New Roman"/>
-          <w:b/>
-          <w:sz w:val="28"/>
-        </w:rPr>
-        <w:t>6. Реализованные тест-кейсы</w:t>
-      </w:r>
-    </w:p>
-    <w:p>
-      <w:pPr>
-        <w:spacing w:after="120" w:line="276" w:lineRule="auto"/>
-      </w:pPr>
-      <w:r>
-        <w:rPr>
-          <w:rFonts w:ascii="Times New Roman" w:hAnsi="Times New Roman" w:eastAsia="Times New Roman"/>
-          <w:b w:val="0"/>
-          <w:sz w:val="24"/>
-        </w:rPr>
-        <w:t>TC1. test_po_open_secondary_window — открытие второго окна через Page Object.</w:t>
-      </w:r>
-    </w:p>
-    <w:p>
-      <w:pPr>
-        <w:spacing w:after="120" w:line="276" w:lineRule="auto"/>
-      </w:pPr>
-      <w:r>
-        <w:rPr>
-          <w:rFonts w:ascii="Times New Roman" w:hAnsi="Times New Roman" w:eastAsia="Times New Roman"/>
-          <w:b w:val="0"/>
-          <w:sz w:val="24"/>
-        </w:rPr>
-        <w:t>TC2. test_po_switch_and_verify_secondary_content — переключение и проверка контента.</w:t>
-      </w:r>
-    </w:p>
-    <w:p>
-      <w:pPr>
-        <w:spacing w:after="120" w:line="276" w:lineRule="auto"/>
-      </w:pPr>
-      <w:r>
-        <w:rPr>
-          <w:rFonts w:ascii="Times New Roman" w:hAnsi="Times New Roman" w:eastAsia="Times New Roman"/>
-          <w:b w:val="0"/>
-          <w:sz w:val="24"/>
-        </w:rPr>
-        <w:t>TC3. test_po_close_secondary_and_return — закрытие вторичного окна и возврат.</w:t>
-      </w:r>
-    </w:p>
-    <w:p>
-      <w:pPr>
-        <w:spacing w:after="120" w:line="276" w:lineRule="auto"/>
-      </w:pPr>
-      <w:r>
-        <w:rPr>
-          <w:rFonts w:ascii="Times New Roman" w:hAnsi="Times New Roman" w:eastAsia="Times New Roman"/>
-          <w:b w:val="0"/>
-          <w:sz w:val="24"/>
-        </w:rPr>
-        <w:t>TC4. test_po_iframe_interact_and_return_to_default — iframe + default_content().</w:t>
-      </w:r>
-    </w:p>
-    <w:p>
-      <w:pPr>
-        <w:spacing w:after="120" w:line="276" w:lineRule="auto"/>
-      </w:pPr>
-      <w:r>
-        <w:rPr>
-          <w:rFonts w:ascii="Times New Roman" w:hAnsi="Times New Roman" w:eastAsia="Times New Roman"/>
-          <w:b w:val="0"/>
-          <w:sz w:val="24"/>
-        </w:rPr>
-        <w:t>Assertions о заголовках, текстах и количестве окон остаются в тестах.</w:t>
-      </w:r>
-    </w:p>
-    <w:p>
-      <w:pPr>
-        <w:pStyle w:val="Heading1"/>
-      </w:pPr>
-      <w:r>
-        <w:rPr>
-          <w:rFonts w:ascii="Times New Roman" w:hAnsi="Times New Roman" w:eastAsia="Times New Roman"/>
-          <w:b/>
-          <w:sz w:val="28"/>
-        </w:rPr>
-        <w:t>7. Фактические результаты</w:t>
-      </w:r>
-    </w:p>
-    <w:p>
-      <w:pPr>
-        <w:spacing w:after="120" w:line="276" w:lineRule="auto"/>
-      </w:pPr>
-      <w:r>
-        <w:rPr>
-          <w:rFonts w:ascii="Times New Roman" w:hAnsi="Times New Roman" w:eastAsia="Times New Roman"/>
-          <w:b w:val="0"/>
-          <w:sz w:val="24"/>
-        </w:rPr>
-        <w:t>Среда: Windows 11, Python 3.13.9, pytest 8.4.2, Selenium 4.50.0, Chrome 154.0.8037.98.</w:t>
-      </w:r>
-    </w:p>
-    <w:p>
-      <w:pPr>
-        <w:spacing w:after="120" w:line="276" w:lineRule="auto"/>
-      </w:pPr>
-      <w:r>
-        <w:rPr>
-          <w:rFonts w:ascii="Times New Roman" w:hAnsi="Times New Roman" w:eastAsia="Times New Roman"/>
-          <w:b w:val="0"/>
-          <w:sz w:val="24"/>
-        </w:rPr>
-        <w:t>Команда: pytest selenium\tests\test_kt03_page_object.py -v --browser=chrome</w:t>
-      </w:r>
-    </w:p>
-    <w:p>
-      <w:pPr>
-        <w:spacing w:after="0" w:before="0" w:line="240" w:lineRule="auto"/>
-      </w:pPr>
-      <w:r>
-        <w:rPr>
-          <w:rFonts w:ascii="Consolas" w:hAnsi="Consolas" w:eastAsia="Consolas"/>
-          <w:b w:val="0"/>
-          <w:sz w:val="18"/>
-        </w:rPr>
-        <w:t>============================= test session starts =============================</w:t>
-      </w:r>
-    </w:p>
-    <w:p>
-      <w:pPr>
-        <w:spacing w:after="0" w:before="0" w:line="240" w:lineRule="auto"/>
-      </w:pPr>
-      <w:r>
-        <w:rPr>
-          <w:rFonts w:ascii="Consolas" w:hAnsi="Consolas" w:eastAsia="Consolas"/>
-          <w:b w:val="0"/>
-          <w:sz w:val="18"/>
-        </w:rPr>
-        <w:t>platform win32 -- Python 3.13.9, pytest-8.4.2, pluggy-1.6.0</w:t>
-      </w:r>
-    </w:p>
-    <w:p>
-      <w:pPr>
-        <w:spacing w:after="0" w:before="0" w:line="240" w:lineRule="auto"/>
-      </w:pPr>
-      <w:r>
-        <w:rPr>
-          <w:rFonts w:ascii="Consolas" w:hAnsi="Consolas" w:eastAsia="Consolas"/>
-          <w:b w:val="0"/>
-          <w:sz w:val="18"/>
-        </w:rPr>
-        <w:t>configfile: pytest.ini</w:t>
-      </w:r>
-    </w:p>
-    <w:p>
-      <w:pPr>
-        <w:spacing w:after="0" w:before="0" w:line="240" w:lineRule="auto"/>
-      </w:pPr>
-      <w:r>
-        <w:rPr>
-          <w:rFonts w:ascii="Consolas" w:hAnsi="Consolas" w:eastAsia="Consolas"/>
-          <w:b w:val="0"/>
-          <w:sz w:val="18"/>
-        </w:rPr>
-        <w:t>collecting ... collected 4 items</w:t>
-      </w:r>
-    </w:p>
-    <w:p>
-      <w:pPr>
-        <w:spacing w:after="0" w:before="0" w:line="240" w:lineRule="auto"/>
-      </w:pPr>
-      <w:r>
-        <w:rPr>
-          <w:rFonts w:ascii="Consolas" w:hAnsi="Consolas" w:eastAsia="Consolas"/>
-          <w:b w:val="0"/>
-          <w:sz w:val="18"/>
-        </w:rPr>
-        <w:t xml:space="preserve"> </w:t>
-      </w:r>
-    </w:p>
-    <w:p>
-      <w:pPr>
-        <w:spacing w:after="0" w:before="0" w:line="240" w:lineRule="auto"/>
-      </w:pPr>
-      <w:r>
-        <w:rPr>
-          <w:rFonts w:ascii="Consolas" w:hAnsi="Consolas" w:eastAsia="Consolas"/>
-          <w:b w:val="0"/>
-          <w:sz w:val="18"/>
-        </w:rPr>
-        <w:t>selenium/tests/test_kt03_page_object.py::test_po_open_secondary_window PASSED</w:t>
-      </w:r>
-    </w:p>
-    <w:p>
-      <w:pPr>
-        <w:spacing w:after="0" w:before="0" w:line="240" w:lineRule="auto"/>
-      </w:pPr>
-      <w:r>
-        <w:rPr>
-          <w:rFonts w:ascii="Consolas" w:hAnsi="Consolas" w:eastAsia="Consolas"/>
-          <w:b w:val="0"/>
-          <w:sz w:val="18"/>
-        </w:rPr>
-        <w:t>selenium/tests/test_kt03_page_object.py::test_po_switch_and_verify_secondary_content PASSED</w:t>
-      </w:r>
-    </w:p>
-    <w:p>
-      <w:pPr>
-        <w:spacing w:after="0" w:before="0" w:line="240" w:lineRule="auto"/>
-      </w:pPr>
-      <w:r>
-        <w:rPr>
-          <w:rFonts w:ascii="Consolas" w:hAnsi="Consolas" w:eastAsia="Consolas"/>
-          <w:b w:val="0"/>
-          <w:sz w:val="18"/>
-        </w:rPr>
-        <w:t>selenium/tests/test_kt03_page_object.py::test_po_close_secondary_and_return PASSED</w:t>
-      </w:r>
-    </w:p>
-    <w:p>
-      <w:pPr>
-        <w:spacing w:after="0" w:before="0" w:line="240" w:lineRule="auto"/>
-      </w:pPr>
-      <w:r>
-        <w:rPr>
-          <w:rFonts w:ascii="Consolas" w:hAnsi="Consolas" w:eastAsia="Consolas"/>
-          <w:b w:val="0"/>
-          <w:sz w:val="18"/>
-        </w:rPr>
-        <w:t>selenium/tests/test_kt03_page_object.py::test_po_iframe_interact_and_return_to_default PASSED</w:t>
-      </w:r>
-    </w:p>
-    <w:p>
-      <w:pPr>
-        <w:spacing w:after="0" w:before="0" w:line="240" w:lineRule="auto"/>
-      </w:pPr>
-      <w:r>
-        <w:rPr>
-          <w:rFonts w:ascii="Consolas" w:hAnsi="Consolas" w:eastAsia="Consolas"/>
-          <w:b w:val="0"/>
-          <w:sz w:val="18"/>
-        </w:rPr>
-        <w:t xml:space="preserve"> </w:t>
-      </w:r>
-    </w:p>
-    <w:p>
-      <w:pPr>
-        <w:spacing w:after="0" w:before="0" w:line="240" w:lineRule="auto"/>
-      </w:pPr>
-      <w:r>
-        <w:rPr>
-          <w:rFonts w:ascii="Consolas" w:hAnsi="Consolas" w:eastAsia="Consolas"/>
-          <w:b w:val="0"/>
-          <w:sz w:val="18"/>
-        </w:rPr>
-        <w:t>============================= 4 passed in 14.90s ==============================</w:t>
-      </w:r>
-    </w:p>
-    <w:p>
-      <w:pPr>
-        <w:spacing w:after="120" w:line="276" w:lineRule="auto"/>
-      </w:pPr>
-      <w:r>
-        <w:rPr>
-          <w:rFonts w:ascii="Times New Roman" w:hAnsi="Times New Roman" w:eastAsia="Times New Roman"/>
-          <w:b w:val="0"/>
-          <w:sz w:val="24"/>
-        </w:rPr>
-        <w:t>Регрессия КТ 01 + КТ 02:</w:t>
-      </w:r>
-    </w:p>
-    <w:p>
-      <w:pPr>
-        <w:spacing w:after="0" w:before="0" w:line="240" w:lineRule="auto"/>
-      </w:pPr>
-      <w:r>
-        <w:rPr>
-          <w:rFonts w:ascii="Consolas" w:hAnsi="Consolas" w:eastAsia="Consolas"/>
-          <w:b w:val="0"/>
-          <w:sz w:val="18"/>
-        </w:rPr>
-        <w:t>selenium/tests/test_kt01_ya_ru.py::test_open_ya_ru PASSED</w:t>
-      </w:r>
-    </w:p>
-    <w:p>
-      <w:pPr>
-        <w:spacing w:after="0" w:before="0" w:line="240" w:lineRule="auto"/>
-      </w:pPr>
-      <w:r>
-        <w:rPr>
-          <w:rFonts w:ascii="Consolas" w:hAnsi="Consolas" w:eastAsia="Consolas"/>
-          <w:b w:val="0"/>
-          <w:sz w:val="18"/>
-        </w:rPr>
-        <w:t>selenium/tests/test_kt02_windows.py::... 4 tests PASSED</w:t>
-      </w:r>
-    </w:p>
-    <w:p>
-      <w:pPr>
-        <w:spacing w:after="0" w:before="0" w:line="240" w:lineRule="auto"/>
-      </w:pPr>
-      <w:r>
-        <w:rPr>
-          <w:rFonts w:ascii="Consolas" w:hAnsi="Consolas" w:eastAsia="Consolas"/>
-          <w:b w:val="0"/>
-          <w:sz w:val="18"/>
-        </w:rPr>
-        <w:t>selenium/tests/test_kt02_iframe.py::... 2 tests PASSED</w:t>
-      </w:r>
-    </w:p>
-    <w:p>
-      <w:pPr>
-        <w:spacing w:after="0" w:before="0" w:line="240" w:lineRule="auto"/>
-      </w:pPr>
-      <w:r>
-        <w:rPr>
-          <w:rFonts w:ascii="Consolas" w:hAnsi="Consolas" w:eastAsia="Consolas"/>
-          <w:b w:val="0"/>
-          <w:sz w:val="18"/>
-        </w:rPr>
-        <w:t>============================= 7 passed in 29.05s ==============================</w:t>
-      </w:r>
-    </w:p>
-    <w:p>
-      <w:pPr>
-        <w:spacing w:after="120" w:line="276" w:lineRule="auto"/>
-      </w:pPr>
-      <w:r>
-        <w:rPr>
-          <w:rFonts w:ascii="Times New Roman" w:hAnsi="Times New Roman" w:eastAsia="Times New Roman"/>
-          <w:b w:val="0"/>
-          <w:sz w:val="24"/>
-        </w:rPr>
-        <w:t>Итог: KT03 — 4 passed за 14.90 с (exit 0, warnings нет); регрессия — 7 passed за 29.05 с (exit 0).</w:t>
-      </w:r>
-    </w:p>
-    <w:p>
-      <w:pPr>
-        <w:pStyle w:val="Heading1"/>
-      </w:pPr>
-      <w:r>
-        <w:rPr>
-          <w:rFonts w:ascii="Times New Roman" w:hAnsi="Times New Roman" w:eastAsia="Times New Roman"/>
-          <w:b/>
-          <w:sz w:val="28"/>
-        </w:rPr>
-        <w:t>8. Скриншоты фактического запуска</w:t>
+        <w:t>5. Скриншоты — исторический слой</w:t>
       </w:r>
     </w:p>
     <w:p>
@@ -1108,7 +441,7 @@
           <w:b w:val="0"/>
           <w:sz w:val="22"/>
         </w:rPr>
-        <w:t>Рисунок 1 — Главное окно до открытия (Page Object)</w:t>
+        <w:t>Рисунок 1 — Главное окно (локальный PO)</w:t>
       </w:r>
     </w:p>
     <w:p>
@@ -1157,7 +490,7 @@
           <w:b w:val="0"/>
           <w:sz w:val="22"/>
         </w:rPr>
-        <w:t>Рисунок 2 — Переключение на вторичное окно через WindowsSecondaryPage</w:t>
+        <w:t>Рисунок 2 — Вторичное окно через WindowsSecondaryPage</w:t>
       </w:r>
     </w:p>
     <w:p>
@@ -1255,7 +588,7 @@
           <w:b w:val="0"/>
           <w:sz w:val="22"/>
         </w:rPr>
-        <w:t>Рисунок 4 — Возврат в исходное окно после close_and_return_to()</w:t>
+        <w:t>Рисунок 4 — Возврат в исходное окно</w:t>
       </w:r>
     </w:p>
     <w:p>
@@ -1304,7 +637,7 @@
           <w:b w:val="0"/>
           <w:sz w:val="22"/>
         </w:rPr>
-        <w:t>Рисунок 5 — Host-страница с iframe (IframePage)</w:t>
+        <w:t>Рисунок 5 — Host с iframe (IframePage)</w:t>
       </w:r>
     </w:p>
     <w:p>
@@ -1353,7 +686,7 @@
           <w:b w:val="0"/>
           <w:sz w:val="22"/>
         </w:rPr>
-        <w:t>Рисунок 6 — Взаимодействие внутри iframe через Page Object</w:t>
+        <w:t>Рисунок 6 — Взаимодействие внутри iframe</w:t>
       </w:r>
     </w:p>
     <w:p>
@@ -1402,7 +735,7 @@
           <w:b w:val="0"/>
           <w:sz w:val="22"/>
         </w:rPr>
-        <w:t>Рисунок 7 — Возврат в основной документ (leave_iframe)</w:t>
+        <w:t>Рисунок 7 — leave_iframe / default_content</w:t>
       </w:r>
     </w:p>
     <w:p>
@@ -1415,72 +748,301 @@
           <w:b/>
           <w:sz w:val="28"/>
         </w:rPr>
-        <w:t>9. Преимущества Page Object</w:t>
+        <w:t>6. Скриншоты — публичный Sauce Demo</w:t>
+      </w:r>
+    </w:p>
+    <w:p>
+      <w:r>
+        <w:drawing>
+          <wp:inline xmlns:a="http://schemas.openxmlformats.org/drawingml/2006/main" xmlns:pic="http://schemas.openxmlformats.org/drawingml/2006/picture">
+            <wp:extent cx="5040000" cy="3091734"/>
+            <wp:docPr id="8" name="Picture 8"/>
+            <wp:cNvGraphicFramePr>
+              <a:graphicFrameLocks noChangeAspect="1"/>
+            </wp:cNvGraphicFramePr>
+            <a:graphic>
+              <a:graphicData uri="http://schemas.openxmlformats.org/drawingml/2006/picture">
+                <pic:pic>
+                  <pic:nvPicPr>
+                    <pic:cNvPr id="0" name="po_01_login_form.png"/>
+                    <pic:cNvPicPr/>
+                  </pic:nvPicPr>
+                  <pic:blipFill>
+                    <a:blip r:embed="rId14"/>
+                    <a:stretch>
+                      <a:fillRect/>
+                    </a:stretch>
+                  </pic:blipFill>
+                  <pic:spPr>
+                    <a:xfrm>
+                      <a:off x="0" y="0"/>
+                      <a:ext cx="5040000" cy="3091734"/>
+                    </a:xfrm>
+                    <a:prstGeom prst="rect"/>
+                  </pic:spPr>
+                </pic:pic>
+              </a:graphicData>
+            </a:graphic>
+          </wp:inline>
+        </w:drawing>
       </w:r>
     </w:p>
     <w:p>
       <w:pPr>
-        <w:spacing w:after="120" w:line="276" w:lineRule="auto"/>
+        <w:jc w:val="center"/>
       </w:pPr>
       <w:r>
         <w:rPr>
           <w:rFonts w:ascii="Times New Roman" w:hAnsi="Times New Roman" w:eastAsia="Times New Roman"/>
           <w:b w:val="0"/>
-          <w:sz w:val="24"/>
+          <w:sz w:val="22"/>
         </w:rPr>
-        <w:t>• Локаторы сосредоточены в классах страниц, а не размазаны по тестам.</w:t>
+        <w:t>Рисунок 8 — SauceLoginPage: форма login</w:t>
+      </w:r>
+    </w:p>
+    <w:p>
+      <w:r>
+        <w:drawing>
+          <wp:inline xmlns:a="http://schemas.openxmlformats.org/drawingml/2006/main" xmlns:pic="http://schemas.openxmlformats.org/drawingml/2006/picture">
+            <wp:extent cx="5040000" cy="3091734"/>
+            <wp:docPr id="9" name="Picture 9"/>
+            <wp:cNvGraphicFramePr>
+              <a:graphicFrameLocks noChangeAspect="1"/>
+            </wp:cNvGraphicFramePr>
+            <a:graphic>
+              <a:graphicData uri="http://schemas.openxmlformats.org/drawingml/2006/picture">
+                <pic:pic>
+                  <pic:nvPicPr>
+                    <pic:cNvPr id="0" name="po_02_inventory_via_po.png"/>
+                    <pic:cNvPicPr/>
+                  </pic:nvPicPr>
+                  <pic:blipFill>
+                    <a:blip r:embed="rId15"/>
+                    <a:stretch>
+                      <a:fillRect/>
+                    </a:stretch>
+                  </pic:blipFill>
+                  <pic:spPr>
+                    <a:xfrm>
+                      <a:off x="0" y="0"/>
+                      <a:ext cx="5040000" cy="3091734"/>
+                    </a:xfrm>
+                    <a:prstGeom prst="rect"/>
+                  </pic:spPr>
+                </pic:pic>
+              </a:graphicData>
+            </a:graphic>
+          </wp:inline>
+        </w:drawing>
       </w:r>
     </w:p>
     <w:p>
       <w:pPr>
-        <w:spacing w:after="120" w:line="276" w:lineRule="auto"/>
+        <w:jc w:val="center"/>
       </w:pPr>
       <w:r>
         <w:rPr>
           <w:rFonts w:ascii="Times New Roman" w:hAnsi="Times New Roman" w:eastAsia="Times New Roman"/>
           <w:b w:val="0"/>
-          <w:sz w:val="24"/>
+          <w:sz w:val="22"/>
         </w:rPr>
-        <w:t>• Повторное использование действий (открыть окно, войти в iframe) без копипаста.</w:t>
+        <w:t>Рисунок 9 — SauceInventoryPage после login</w:t>
+      </w:r>
+    </w:p>
+    <w:p>
+      <w:r>
+        <w:drawing>
+          <wp:inline xmlns:a="http://schemas.openxmlformats.org/drawingml/2006/main" xmlns:pic="http://schemas.openxmlformats.org/drawingml/2006/picture">
+            <wp:extent cx="5040000" cy="3091734"/>
+            <wp:docPr id="10" name="Picture 10"/>
+            <wp:cNvGraphicFramePr>
+              <a:graphicFrameLocks noChangeAspect="1"/>
+            </wp:cNvGraphicFramePr>
+            <a:graphic>
+              <a:graphicData uri="http://schemas.openxmlformats.org/drawingml/2006/picture">
+                <pic:pic>
+                  <pic:nvPicPr>
+                    <pic:cNvPr id="0" name="po_03_product_details.png"/>
+                    <pic:cNvPicPr/>
+                  </pic:nvPicPr>
+                  <pic:blipFill>
+                    <a:blip r:embed="rId16"/>
+                    <a:stretch>
+                      <a:fillRect/>
+                    </a:stretch>
+                  </pic:blipFill>
+                  <pic:spPr>
+                    <a:xfrm>
+                      <a:off x="0" y="0"/>
+                      <a:ext cx="5040000" cy="3091734"/>
+                    </a:xfrm>
+                    <a:prstGeom prst="rect"/>
+                  </pic:spPr>
+                </pic:pic>
+              </a:graphicData>
+            </a:graphic>
+          </wp:inline>
+        </w:drawing>
       </w:r>
     </w:p>
     <w:p>
       <w:pPr>
-        <w:spacing w:after="120" w:line="276" w:lineRule="auto"/>
+        <w:jc w:val="center"/>
       </w:pPr>
       <w:r>
         <w:rPr>
           <w:rFonts w:ascii="Times New Roman" w:hAnsi="Times New Roman" w:eastAsia="Times New Roman"/>
           <w:b w:val="0"/>
-          <w:sz w:val="24"/>
+          <w:sz w:val="22"/>
         </w:rPr>
-        <w:t>• Тесты читаются как сценарии пользователя и содержат только проверки.</w:t>
+        <w:t>Рисунок 10 — SauceProductPage</w:t>
+      </w:r>
+    </w:p>
+    <w:p>
+      <w:r>
+        <w:drawing>
+          <wp:inline xmlns:a="http://schemas.openxmlformats.org/drawingml/2006/main" xmlns:pic="http://schemas.openxmlformats.org/drawingml/2006/picture">
+            <wp:extent cx="5040000" cy="3091734"/>
+            <wp:docPr id="11" name="Picture 11"/>
+            <wp:cNvGraphicFramePr>
+              <a:graphicFrameLocks noChangeAspect="1"/>
+            </wp:cNvGraphicFramePr>
+            <a:graphic>
+              <a:graphicData uri="http://schemas.openxmlformats.org/drawingml/2006/picture">
+                <pic:pic>
+                  <pic:nvPicPr>
+                    <pic:cNvPr id="0" name="po_04_cart.png"/>
+                    <pic:cNvPicPr/>
+                  </pic:nvPicPr>
+                  <pic:blipFill>
+                    <a:blip r:embed="rId17"/>
+                    <a:stretch>
+                      <a:fillRect/>
+                    </a:stretch>
+                  </pic:blipFill>
+                  <pic:spPr>
+                    <a:xfrm>
+                      <a:off x="0" y="0"/>
+                      <a:ext cx="5040000" cy="3091734"/>
+                    </a:xfrm>
+                    <a:prstGeom prst="rect"/>
+                  </pic:spPr>
+                </pic:pic>
+              </a:graphicData>
+            </a:graphic>
+          </wp:inline>
+        </w:drawing>
       </w:r>
     </w:p>
     <w:p>
       <w:pPr>
-        <w:spacing w:after="120" w:line="276" w:lineRule="auto"/>
+        <w:jc w:val="center"/>
       </w:pPr>
       <w:r>
         <w:rPr>
           <w:rFonts w:ascii="Times New Roman" w:hAnsi="Times New Roman" w:eastAsia="Times New Roman"/>
           <w:b w:val="0"/>
-          <w:sz w:val="24"/>
+          <w:sz w:val="22"/>
         </w:rPr>
-        <w:t>• Изменение HTML-фикстуры требует правки Page Object, а не каждого теста.</w:t>
+        <w:t>Рисунок 11 — SauceCartPage</w:t>
+      </w:r>
+    </w:p>
+    <w:p>
+      <w:r>
+        <w:drawing>
+          <wp:inline xmlns:a="http://schemas.openxmlformats.org/drawingml/2006/main" xmlns:pic="http://schemas.openxmlformats.org/drawingml/2006/picture">
+            <wp:extent cx="5040000" cy="3091734"/>
+            <wp:docPr id="12" name="Picture 12"/>
+            <wp:cNvGraphicFramePr>
+              <a:graphicFrameLocks noChangeAspect="1"/>
+            </wp:cNvGraphicFramePr>
+            <a:graphic>
+              <a:graphicData uri="http://schemas.openxmlformats.org/drawingml/2006/picture">
+                <pic:pic>
+                  <pic:nvPicPr>
+                    <pic:cNvPr id="0" name="po_05_checkout_complete.png"/>
+                    <pic:cNvPicPr/>
+                  </pic:nvPicPr>
+                  <pic:blipFill>
+                    <a:blip r:embed="rId18"/>
+                    <a:stretch>
+                      <a:fillRect/>
+                    </a:stretch>
+                  </pic:blipFill>
+                  <pic:spPr>
+                    <a:xfrm>
+                      <a:off x="0" y="0"/>
+                      <a:ext cx="5040000" cy="3091734"/>
+                    </a:xfrm>
+                    <a:prstGeom prst="rect"/>
+                  </pic:spPr>
+                </pic:pic>
+              </a:graphicData>
+            </a:graphic>
+          </wp:inline>
+        </w:drawing>
       </w:r>
     </w:p>
     <w:p>
       <w:pPr>
-        <w:spacing w:after="120" w:line="276" w:lineRule="auto"/>
+        <w:jc w:val="center"/>
       </w:pPr>
       <w:r>
         <w:rPr>
           <w:rFonts w:ascii="Times New Roman" w:hAnsi="Times New Roman" w:eastAsia="Times New Roman"/>
           <w:b w:val="0"/>
-          <w:sz w:val="24"/>
+          <w:sz w:val="22"/>
         </w:rPr>
-        <w:t>По сравнению с прямыми вызовами Selenium в КТ 02 код КТ 03 короче на уровне сценария и устойчивее к рефакторингу UI.</w:t>
+        <w:t>Рисунок 12 — SauceCheckoutPage complete</w:t>
+      </w:r>
+    </w:p>
+    <w:p>
+      <w:r>
+        <w:drawing>
+          <wp:inline xmlns:a="http://schemas.openxmlformats.org/drawingml/2006/main" xmlns:pic="http://schemas.openxmlformats.org/drawingml/2006/picture">
+            <wp:extent cx="5040000" cy="3091734"/>
+            <wp:docPr id="13" name="Picture 13"/>
+            <wp:cNvGraphicFramePr>
+              <a:graphicFrameLocks noChangeAspect="1"/>
+            </wp:cNvGraphicFramePr>
+            <a:graphic>
+              <a:graphicData uri="http://schemas.openxmlformats.org/drawingml/2006/picture">
+                <pic:pic>
+                  <pic:nvPicPr>
+                    <pic:cNvPr id="0" name="po_06_logout.png"/>
+                    <pic:cNvPicPr/>
+                  </pic:nvPicPr>
+                  <pic:blipFill>
+                    <a:blip r:embed="rId19"/>
+                    <a:stretch>
+                      <a:fillRect/>
+                    </a:stretch>
+                  </pic:blipFill>
+                  <pic:spPr>
+                    <a:xfrm>
+                      <a:off x="0" y="0"/>
+                      <a:ext cx="5040000" cy="3091734"/>
+                    </a:xfrm>
+                    <a:prstGeom prst="rect"/>
+                  </pic:spPr>
+                </pic:pic>
+              </a:graphicData>
+            </a:graphic>
+          </wp:inline>
+        </w:drawing>
+      </w:r>
+    </w:p>
+    <w:p>
+      <w:pPr>
+        <w:jc w:val="center"/>
+      </w:pPr>
+      <w:r>
+        <w:rPr>
+          <w:rFonts w:ascii="Times New Roman" w:hAnsi="Times New Roman" w:eastAsia="Times New Roman"/>
+          <w:b w:val="0"/>
+          <w:sz w:val="22"/>
+        </w:rPr>
+        <w:t>Рисунок 13 — logout через Page Object</w:t>
       </w:r>
     </w:p>
     <w:p>
@@ -1493,12 +1055,12 @@
           <w:b/>
           <w:sz w:val="28"/>
         </w:rPr>
-        <w:t>10. Заключение</w:t>
+        <w:t>7. Заключение</w:t>
       </w:r>
     </w:p>
     <w:p>
       <w:pPr>
-        <w:spacing w:after="120" w:line="276" w:lineRule="auto"/>
+        <w:spacing w:after="120"/>
       </w:pPr>
       <w:r>
         <w:rPr>
@@ -1506,7 +1068,7 @@
           <w:b w:val="0"/>
           <w:sz w:val="24"/>
         </w:rPr>
-        <w:t>Контрольная точка №3 выполнена: реализованы BasePage, WindowsPage (WindowsMainPage/WindowsSecondaryPage) и IframePage; написаны четыре автотеста на Page Object с реальными скриншотами; регрессия КТ 01 и КТ 02 успешна. Архитектура намеренно простая — наследование от BasePage без избыточных слоёв.</w:t>
+        <w:t>КТ №3: публичный Page Object на Sauce Demo (5 PASS / 21.11 с) при сохранении локального PO окон/iframe (4 PASS / 14.90 с).</w:t>
       </w:r>
     </w:p>
     <w:sectPr>

</xml_diff>